<commit_message>
Hoan thanh Lab 5 (SQL Injection), cap nhat Nhat ky docx va them Guide 06 Race Conditions
</commit_message>
<xml_diff>
--- a/Nhat_Ky_Hoc_Tap_Va_Thuc_Hanh_Security.docx
+++ b/Nhat_Ky_Hoc_Tap_Va_Thuc_Hanh_Security.docx
@@ -155,7 +155,7 @@
           </w:tcPr>
           <w:p>
             <w:r>
-              <w:t>12 bài Labs (Cơ bản Apprentice &amp; Nâng cao Practitioner)</w:t>
+              <w:t>15 bài Labs (Cơ bản Apprentice &amp; Nâng cao Practitioner)</w:t>
             </w:r>
           </w:p>
         </w:tc>
@@ -1674,9 +1674,9 @@
             <w:r>
               <w:rPr>
                 <w:b/>
-                <w:color w:val="EA580C"/>
+                <w:color w:val="10B981"/>
               </w:rPr>
-              <w:t>⏳ ĐANG THỰC HIỆN</w:t>
+              <w:t>✅ ĐÃ HOÀN THÀNH</w:t>
             </w:r>
           </w:p>
         </w:tc>

</xml_diff>

<commit_message>
Bo sung phan tich chuyen sau: Cac vi tri khai thac SQL Injection ngoai URL
</commit_message>
<xml_diff>
--- a/Nhat_Ky_Hoc_Tap_Va_Thuc_Hanh_Security.docx
+++ b/Nhat_Ky_Hoc_Tap_Va_Thuc_Hanh_Security.docx
@@ -1133,6 +1133,150 @@
           <w:color w:val="0F766E"/>
           <w:sz w:val="26"/>
         </w:rPr>
+        <w:t>Các Vị Trí Khai Thác SQL Injection Ngoài URL (Thực Chiến)</w:t>
+      </w:r>
+    </w:p>
+    <w:p>
+      <w:r>
+        <w:t>URL chỉ là bề nổi của tảng băng chìm. Trong thực tế, SQLi xuất hiện ở bất kỳ điểm nào dữ liệu bên ngoài đi vào câu truy vấn:</w:t>
+      </w:r>
+    </w:p>
+    <w:p>
+      <w:pPr>
+        <w:pStyle w:val="ListBullet"/>
+        <w:spacing w:before="20" w:after="60"/>
+      </w:pPr>
+      <w:r>
+        <w:rPr>
+          <w:b/>
+        </w:rPr>
+        <w:t xml:space="preserve">1. Trong Request Body (JSON REST API &amp; Form): </w:t>
+      </w:r>
+      <w:r>
+        <w:t>API tìm kiếm nhận JSON body {'keyword': 'iphone\' OR 1=1--'}, form đăng nhập nhận username administrator\'--.</w:t>
+      </w:r>
+    </w:p>
+    <w:p>
+      <w:pPr>
+        <w:pStyle w:val="ListBullet"/>
+        <w:spacing w:before="20" w:after="60"/>
+      </w:pPr>
+      <w:r>
+        <w:rPr>
+          <w:b/>
+        </w:rPr>
+        <w:t xml:space="preserve">2. Trong HTTP Headers (User-Agent, Cookie, IP): </w:t>
+      </w:r>
+      <w:r>
+        <w:t>Backend ghi log thiết bị INSERT INTO logs (ip, user_agent) VALUES ('...', '$userAgent') ➔ Breaker tiêm mã SQL ngay trong Header User-Agent hoặc Cookie theo dõi.</w:t>
+      </w:r>
+    </w:p>
+    <w:p>
+      <w:pPr>
+        <w:pStyle w:val="ListBullet"/>
+        <w:spacing w:before="20" w:after="60"/>
+      </w:pPr>
+      <w:r>
+        <w:rPr>
+          <w:b/>
+        </w:rPr>
+        <w:t xml:space="preserve">3. Second-Order SQLi (SQLi Bậc 2 - Bom hẹn giờ): </w:t>
+      </w:r>
+      <w:r>
+        <w:t>Dữ liệu được lưu an toàn vào DB lúc đăng ký (admin\'--), nhưng sau đó ở chức năng đổi mật khẩu hoặc báo cáo, dev lại lấy username từ DB ra rồi nối chuỗi ➔ Mã độc phát hỏa.</w:t>
+      </w:r>
+    </w:p>
+    <w:p>
+      <w:pPr>
+        <w:pStyle w:val="ListBullet"/>
+        <w:spacing w:before="20" w:after="60"/>
+      </w:pPr>
+      <w:r>
+        <w:rPr>
+          <w:b/>
+        </w:rPr>
+        <w:t xml:space="preserve">4. Tên tệp tin tải lên (File Upload): </w:t>
+      </w:r>
+      <w:r>
+        <w:t>Tên file chứa ký tự phá vỡ cú pháp SQL như avatar\'; DROP TABLE users;--.png khi lưu vào DB.</w:t>
+      </w:r>
+    </w:p>
+    <w:tbl>
+      <w:tblPr>
+        <w:tblW w:type="auto" w:w="0"/>
+        <w:jc w:val="center"/>
+        <w:tblLayout w:type="fixed"/>
+        <w:tblLook w:firstColumn="1" w:firstRow="1" w:lastColumn="0" w:lastRow="0" w:noHBand="0" w:noVBand="1" w:val="04A0"/>
+      </w:tblPr>
+      <w:tblGrid>
+        <w:gridCol w:w="9360"/>
+      </w:tblGrid>
+      <w:tr>
+        <w:tc>
+          <w:tcPr>
+            <w:tcW w:type="dxa" w:w="9360"/>
+            <w:shd w:fill="F0F7FF"/>
+            <w:tcMar>
+              <w:top w:w="140" w:type="dxa"/>
+              <w:bottom w:w="140" w:type="dxa"/>
+              <w:left w:w="200" w:type="dxa"/>
+              <w:right w:w="200" w:type="dxa"/>
+            </w:tcMar>
+            <w:tcBorders>
+              <w:top w:val="none"/>
+              <w:left w:val="single" w:sz="24" w:space="0" w:color="2563EB"/>
+              <w:bottom w:val="none"/>
+              <w:right w:val="none"/>
+            </w:tcBorders>
+          </w:tcPr>
+          <w:p>
+            <w:pPr>
+              <w:spacing w:before="40" w:after="80"/>
+            </w:pPr>
+            <w:r>
+              <w:rPr>
+                <w:rFonts w:ascii="Segoe UI" w:hAnsi="Segoe UI"/>
+                <w:b/>
+                <w:color w:val="2563EB"/>
+                <w:sz w:val="21"/>
+              </w:rPr>
+              <w:t>💡 ĐIỂM MÙ PHÒNG THỦ CỦA LẬP TRÌNH VIÊN</w:t>
+              <w:br/>
+            </w:r>
+          </w:p>
+          <w:p>
+            <w:pPr>
+              <w:spacing w:before="20" w:after="40"/>
+            </w:pPr>
+            <w:r>
+              <w:rPr>
+                <w:rFonts w:ascii="Segoe UI" w:hAnsi="Segoe UI"/>
+                <w:color w:val="1E293B"/>
+                <w:sz w:val="20"/>
+              </w:rPr>
+              <w:t>Quy tắc vàng: Đừng chỉ nhìn vào URL bar! Mọi dữ liệu đến từ Header, Cookie, JSON body, hay thậm chí dữ liệu đã nằm sẵn trong Database đều có thể là vector tấn công SQL Injection nếu backend dùng phép cộng chuỗi thô.</w:t>
+            </w:r>
+          </w:p>
+        </w:tc>
+      </w:tr>
+    </w:tbl>
+    <w:p>
+      <w:pPr>
+        <w:spacing w:before="0" w:after="120"/>
+      </w:pPr>
+    </w:p>
+    <w:p>
+      <w:pPr>
+        <w:keepNext/>
+        <w:spacing w:before="280" w:after="120"/>
+      </w:pPr>
+      <w:r>
+        <w:rPr>
+          <w:rFonts w:ascii="Segoe UI" w:hAnsi="Segoe UI"/>
+          <w:b/>
+          <w:color w:val="0F766E"/>
+          <w:sz w:val="26"/>
+        </w:rPr>
         <w:t>Cách vá triệt để ở tầng Backend:</w:t>
       </w:r>
     </w:p>

</xml_diff>